<commit_message>
Finalize USDm terminology migration and repo cleanup
</commit_message>
<xml_diff>
--- a/airbnb-property-management-agreement.docx
+++ b/airbnb-property-management-agreement.docx
@@ -22,17 +22,8 @@
           <w:b/>
           <w:bCs/>
         </w:rPr>
-        <w:t xml:space="preserve">Template — requires legal review before use.</w:t>
-      </w:r>
-    </w:p>
-    <w:p/>
-    <w:p>
-      <w:pPr>
-        <w:pBdr>
-          <w:bottom w:val="single" w:color="AAAAAA" w:sz="6" w:space="1"/>
-        </w:pBdr>
-        <w:spacing w:after="200" w:before="200"/>
-      </w:pPr>
+        <w:t xml:space="preserve">Template: requires legal review before use.</w:t>
+      </w:r>
     </w:p>
     <w:p/>
     <w:p>
@@ -86,7 +77,7 @@
     <w:p>
       <w:pPr>
         <w:pStyle w:val="Heading1"/>
-        <w:spacing w:after="120" w:before="300"/>
+        <w:spacing w:before="300" w:after="120"/>
       </w:pPr>
       <w:r>
         <w:t xml:space="preserve">1. Term</w:t>
@@ -115,7 +106,7 @@
     <w:p>
       <w:pPr>
         <w:pStyle w:val="Heading1"/>
-        <w:spacing w:after="120" w:before="300"/>
+        <w:spacing w:before="300" w:after="120"/>
       </w:pPr>
       <w:r>
         <w:t xml:space="preserve">2. Services</w:t>
@@ -187,7 +178,7 @@
     <w:p>
       <w:pPr>
         <w:pStyle w:val="Heading1"/>
-        <w:spacing w:after="120" w:before="300"/>
+        <w:spacing w:before="300" w:after="120"/>
       </w:pPr>
       <w:r>
         <w:t xml:space="preserve">3. Scheduling</w:t>
@@ -199,14 +190,14 @@
         <w:spacing w:after="120"/>
       </w:pPr>
       <w:r>
-        <w:t xml:space="preserve">Client (or Client's booking platform/calendar integration) provides checkout/check-in times with reasonable notice — minimum notice period: ______________. Service Provider confirms each turnover assignment and reports completion, consistent with FreClean's booking workflow.</w:t>
-      </w:r>
-    </w:p>
-    <w:p/>
-    <w:p>
-      <w:pPr>
-        <w:pStyle w:val="Heading1"/>
-        <w:spacing w:after="120" w:before="300"/>
+        <w:t xml:space="preserve">Client (or Client's booking platform/calendar integration) provides checkout/check-in times with reasonable notice; minimum notice period: ______________. Service Provider confirms each turnover assignment and reports completion, consistent with FreClean's booking workflow.</w:t>
+      </w:r>
+    </w:p>
+    <w:p/>
+    <w:p>
+      <w:pPr>
+        <w:pStyle w:val="Heading1"/>
+        <w:spacing w:before="300" w:after="120"/>
       </w:pPr>
       <w:r>
         <w:t xml:space="preserve">4. Fees &amp; Payment</w:t>
@@ -236,7 +227,7 @@
         <w:spacing w:after="60"/>
       </w:pPr>
       <w:r>
-        <w:t xml:space="preserve">Payment method: ☐ cash ☐ card ☐ Celo stablecoin via FreClean's Web3 payment system (CeloHT).</w:t>
+        <w:t xml:space="preserve">Payment method: ☐ cash ☐ card ☐ USDm via FreClean's Web3 payment system (CeloHT).</w:t>
       </w:r>
     </w:p>
     <w:p>
@@ -262,14 +253,14 @@
         <w:spacing w:after="60"/>
       </w:pPr>
       <w:r>
-        <w:t xml:space="preserve">As with FreClean's other multi-year agreements, a payment-compliance record for this Agreement may be kept in FreClean's on-chain agreement registry — a record-keeping measure only, not a change to either party's obligations.</w:t>
-      </w:r>
-    </w:p>
-    <w:p/>
-    <w:p>
-      <w:pPr>
-        <w:pStyle w:val="Heading1"/>
-        <w:spacing w:after="120" w:before="300"/>
+        <w:t xml:space="preserve">As with FreClean's other multi-year agreements, a payment-compliance record for this Agreement may be kept in FreClean's on-chain agreement registry. This is a record-keeping measure only, not a change to either party's obligations.</w:t>
+      </w:r>
+    </w:p>
+    <w:p/>
+    <w:p>
+      <w:pPr>
+        <w:pStyle w:val="Heading1"/>
+        <w:spacing w:before="300" w:after="120"/>
       </w:pPr>
       <w:r>
         <w:t xml:space="preserve">5. Guest Items &amp; Damage</w:t>
@@ -288,7 +279,7 @@
     <w:p>
       <w:pPr>
         <w:pStyle w:val="Heading1"/>
-        <w:spacing w:after="120" w:before="300"/>
+        <w:spacing w:before="300" w:after="120"/>
       </w:pPr>
       <w:r>
         <w:t xml:space="preserve">6. Access</w:t>
@@ -307,7 +298,7 @@
     <w:p>
       <w:pPr>
         <w:pStyle w:val="Heading1"/>
-        <w:spacing w:after="120" w:before="300"/>
+        <w:spacing w:before="300" w:after="120"/>
       </w:pPr>
       <w:r>
         <w:t xml:space="preserve">7. Insurance &amp; Liability</w:t>
@@ -327,14 +318,14 @@
           <w:iCs/>
           <w:color w:val="666666"/>
         </w:rPr>
-        <w:t xml:space="preserve">(Insurance details: not provided as a default — confirm actual coverage before use.)</w:t>
-      </w:r>
-    </w:p>
-    <w:p/>
-    <w:p>
-      <w:pPr>
-        <w:pStyle w:val="Heading1"/>
-        <w:spacing w:after="120" w:before="300"/>
+        <w:t xml:space="preserve">(Insurance details: not provided as a default; confirm actual coverage before use.)</w:t>
+      </w:r>
+    </w:p>
+    <w:p/>
+    <w:p>
+      <w:pPr>
+        <w:pStyle w:val="Heading1"/>
+        <w:spacing w:before="300" w:after="120"/>
       </w:pPr>
       <w:r>
         <w:t xml:space="preserve">8. Termination</w:t>
@@ -385,7 +376,7 @@
     <w:p>
       <w:pPr>
         <w:pStyle w:val="Heading1"/>
-        <w:spacing w:after="120" w:before="300"/>
+        <w:spacing w:before="300" w:after="120"/>
       </w:pPr>
       <w:r>
         <w:t xml:space="preserve">9. Confidentiality</w:t>
@@ -404,7 +395,7 @@
     <w:p>
       <w:pPr>
         <w:pStyle w:val="Heading1"/>
-        <w:spacing w:after="120" w:before="300"/>
+        <w:spacing w:before="300" w:after="120"/>
       </w:pPr>
       <w:r>
         <w:t xml:space="preserve">10. General</w:t>
@@ -434,17 +425,8 @@
         <w:spacing w:after="60"/>
       </w:pPr>
       <w:r>
-        <w:t xml:space="preserve">Governing law: ______________________________ *(not provided — to be finalized with counsel).*</w:t>
-      </w:r>
-    </w:p>
-    <w:p/>
-    <w:p>
-      <w:pPr>
-        <w:pBdr>
-          <w:bottom w:val="single" w:color="AAAAAA" w:sz="6" w:space="1"/>
-        </w:pBdr>
-        <w:spacing w:after="200" w:before="200"/>
-      </w:pPr>
+        <w:t xml:space="preserve">Governing law: ______________________________ *(not provided; to be finalized with counsel).*</w:t>
+      </w:r>
     </w:p>
     <w:p/>
     <w:p>
@@ -480,15 +462,6 @@
     <w:p/>
     <w:p>
       <w:pPr>
-        <w:pBdr>
-          <w:bottom w:val="single" w:color="AAAAAA" w:sz="6" w:space="1"/>
-        </w:pBdr>
-        <w:spacing w:after="200" w:before="200"/>
-      </w:pPr>
-    </w:p>
-    <w:p/>
-    <w:p>
-      <w:pPr>
         <w:spacing w:after="120"/>
       </w:pPr>
       <w:r>
@@ -496,7 +469,7 @@
           <w:b/>
           <w:bCs/>
         </w:rPr>
-        <w:t xml:space="preserve">Schedule A — Per-Property Rates:</w:t>
+        <w:t xml:space="preserve">Schedule A: Per-Property Rates</w:t>
       </w:r>
       <w:r>
         <w:t xml:space="preserve"> </w:t>
@@ -512,8 +485,8 @@
     </w:p>
     <w:p/>
     <w:sectPr>
-      <w:headerReference w:type="default" r:id="rId7"/>
-      <w:footerReference w:type="default" r:id="rId8"/>
+      <w:headerReference w:type="default" r:id="rId6"/>
+      <w:footerReference w:type="default" r:id="rId7"/>
       <w:pgSz w:w="12240" w:h="15840" w:orient="portrait"/>
       <w:pgMar w:top="1440" w:right="1440" w:bottom="1440" w:left="1440" w:header="708" w:footer="708" w:gutter="0"/>
       <w:pgNumType/>
@@ -525,43 +498,6 @@
 
 <file path=word/comments.xml><?xml version="1.0" encoding="utf-8"?>
 <w:comments xmlns:cx="http://schemas.microsoft.com/office/drawing/2014/chartex" xmlns:cx1="http://schemas.microsoft.com/office/drawing/2015/9/8/chartex" xmlns:cx2="http://schemas.microsoft.com/office/drawing/2015/10/21/chartex" xmlns:cx3="http://schemas.microsoft.com/office/drawing/2016/5/9/chartex" xmlns:cx4="http://schemas.microsoft.com/office/drawing/2016/5/10/chartex" xmlns:cx5="http://schemas.microsoft.com/office/drawing/2016/5/11/chartex" xmlns:cx6="http://schemas.microsoft.com/office/drawing/2016/5/12/chartex" xmlns:cx7="http://schemas.microsoft.com/office/drawing/2016/5/13/chartex" xmlns:cx8="http://schemas.microsoft.com/office/drawing/2016/5/14/chartex" xmlns:mc="http://schemas.openxmlformats.org/markup-compatibility/2006" xmlns:aink="http://schemas.microsoft.com/office/drawing/2016/ink" xmlns:am3d="http://schemas.microsoft.com/office/drawing/2017/model3d" xmlns:o="urn:schemas-microsoft-com:office:office" xmlns:r="http://schemas.openxmlformats.org/officeDocument/2006/relationships" xmlns:m="http://schemas.openxmlformats.org/officeDocument/2006/math" xmlns:v="urn:schemas-microsoft-com:vml" xmlns:wp14="http://schemas.microsoft.com/office/word/2010/wordprocessingDrawing" xmlns:wp="http://schemas.openxmlformats.org/drawingml/2006/wordprocessingDrawing" xmlns:w10="urn:schemas-microsoft-com:office:word" xmlns:w="http://schemas.openxmlformats.org/wordprocessingml/2006/main" xmlns:w14="http://schemas.microsoft.com/office/word/2010/wordml" xmlns:w15="http://schemas.microsoft.com/office/word/2012/wordml" xmlns:w16cex="http://schemas.microsoft.com/office/word/2018/wordml/cex" xmlns:w16cid="http://schemas.microsoft.com/office/word/2016/wordml/cid" xmlns:w16="http://schemas.microsoft.com/office/word/2018/wordml" xmlns:w16sdtdh="http://schemas.microsoft.com/office/word/2020/wordml/sdtdatahash" xmlns:w16se="http://schemas.microsoft.com/office/word/2015/wordml/symex" xmlns:wpg="http://schemas.microsoft.com/office/word/2010/wordprocessingGroup" xmlns:wpi="http://schemas.microsoft.com/office/word/2010/wordprocessingInk" xmlns:wne="http://schemas.microsoft.com/office/word/2006/wordml" xmlns:wps="http://schemas.microsoft.com/office/word/2010/wordprocessingShape"/>
-</file>
-
-<file path=word/endnotes.xml><?xml version="1.0" encoding="utf-8"?>
-<w:endnotes xmlns:wpc="http://schemas.microsoft.com/office/word/2010/wordprocessingCanvas" xmlns:mc="http://schemas.openxmlformats.org/markup-compatibility/2006" xmlns:o="urn:schemas-microsoft-com:office:office" xmlns:r="http://schemas.openxmlformats.org/officeDocument/2006/relationships" xmlns:m="http://schemas.openxmlformats.org/officeDocument/2006/math" xmlns:v="urn:schemas-microsoft-com:vml" xmlns:wp14="http://schemas.microsoft.com/office/word/2010/wordprocessingDrawing" xmlns:wp="http://schemas.openxmlformats.org/drawingml/2006/wordprocessingDrawing" xmlns:w10="urn:schemas-microsoft-com:office:word" xmlns:w="http://schemas.openxmlformats.org/wordprocessingml/2006/main" xmlns:w14="http://schemas.microsoft.com/office/word/2010/wordml" xmlns:w15="http://schemas.microsoft.com/office/word/2012/wordml" xmlns:wpg="http://schemas.microsoft.com/office/word/2010/wordprocessingGroup" xmlns:wpi="http://schemas.microsoft.com/office/word/2010/wordprocessingInk" xmlns:wne="http://schemas.microsoft.com/office/word/2006/wordml" xmlns:wps="http://schemas.microsoft.com/office/word/2010/wordprocessingShape" mc:Ignorable="w14 w15 wp14">
-  <w:endnote w:type="separator" w:id="-1">
-    <w:p>
-      <w:pPr>
-        <w:spacing w:after="0" w:line="240" w:lineRule="auto"/>
-      </w:pPr>
-      <w:r>
-        <w:rPr>
-          <w:rStyle w:val="EndnoteReference"/>
-        </w:rPr>
-        <w:endnoteRef/>
-      </w:r>
-      <w:r>
-        <w:separator/>
-      </w:r>
-    </w:p>
-  </w:endnote>
-  <w:endnote w:type="continuationSeparator" w:id="0">
-    <w:p>
-      <w:pPr>
-        <w:spacing w:after="0" w:line="240" w:lineRule="auto"/>
-      </w:pPr>
-      <w:r>
-        <w:rPr>
-          <w:rStyle w:val="EndnoteReference"/>
-        </w:rPr>
-        <w:endnoteRef/>
-      </w:r>
-      <w:r>
-        <w:continuationSeparator/>
-      </w:r>
-    </w:p>
-  </w:endnote>
-</w:endnotes>
 </file>
 
 <file path=word/footer1.xml><?xml version="1.0" encoding="utf-8"?>
@@ -578,7 +514,7 @@
         <w:sz w:val="16"/>
         <w:szCs w:val="16"/>
       </w:rPr>
-      <w:t xml:space="preserve">FreClean · Léogâne, Ouest, Haiti — Template, pending legal review</w:t>
+      <w:t xml:space="preserve">FreClean · Léogâne, Ouest, Haiti, template pending legal review</w:t>
     </w:r>
     <w:r>
       <w:t xml:space="preserve">	</w:t>
@@ -849,8 +785,8 @@
     <w:uiPriority w:val="99"/>
     <w:unhideWhenUsed/>
     <w:rPr>
+      <w:u w:val="single"/>
       <w:color w:val="0563C1"/>
-      <w:u w:val="single"/>
     </w:rPr>
   </w:style>
   <w:style w:type="character" w:styleId="FootnoteReference">
@@ -890,42 +826,5 @@
       <w:szCs w:val="20"/>
     </w:rPr>
   </w:style>
-  <w:style w:type="character" w:styleId="EndnoteReference">
-    <w:name w:val="endnote reference"/>
-    <w:basedOn w:val="DefaultParagraphFont"/>
-    <w:uiPriority w:val="99"/>
-    <w:semiHidden/>
-    <w:unhideWhenUsed/>
-    <w:rPr>
-      <w:vertAlign w:val="superscript"/>
-    </w:rPr>
-  </w:style>
-  <w:style w:type="paragraph" w:styleId="EndnoteText">
-    <w:name w:val="endnote text"/>
-    <w:basedOn w:val="Normal"/>
-    <w:link w:val="EndnoteTextChar"/>
-    <w:uiPriority w:val="99"/>
-    <w:semiHidden/>
-    <w:unhideWhenUsed/>
-    <w:pPr>
-      <w:spacing w:after="0" w:line="240" w:lineRule="auto"/>
-    </w:pPr>
-    <w:rPr>
-      <w:sz w:val="20"/>
-      <w:szCs w:val="20"/>
-    </w:rPr>
-  </w:style>
-  <w:style w:type="character" w:styleId="EndnoteTextChar">
-    <w:name w:val="Endnote Text Char"/>
-    <w:basedOn w:val="DefaultParagraphFont"/>
-    <w:link w:val="EndnoteText"/>
-    <w:uiPriority w:val="99"/>
-    <w:semiHidden/>
-    <w:unhideWhenUsed/>
-    <w:rPr>
-      <w:sz w:val="20"/>
-      <w:szCs w:val="20"/>
-    </w:rPr>
-  </w:style>
 </w:styles>
 </file>
</xml_diff>